<commit_message>
Apply J11 remediation across paper, decks and notes: withdraw the residency mechanism, correct the per-dollar comparison to a consistent quoted-price basis, disclose the prefix-hit asymmetry, restrict Figure 9 to uncapped concurrencies, correct the Table 4 dispersion claim
</commit_message>
<xml_diff>
--- a/Gisting-NeurIPS-paper.docx
+++ b/Gisting-NeurIPS-paper.docx
@@ -117,7 +117,7 @@
         <w:t>measure what the compression buys</w:t>
       </w:r>
       <w:r>
-        <w:t xml:space="preserve"> at serving time, first in a single replay and then in a tuned, repeated benchmark on two GPU classes, and we report two experiments that our own evaluation harness left unscorable. The detailed numbers and their limits are in the body; here we say only that they motivate further work rather than settle it. Because every result is a single run of small, partly reused, hand-built tasks, we present this as a development study rather than a validated benchmark, with an independent adversarial review of the whole program reconciled into it. The short version, within those limits: the method cut the tokens the model reads each turn by roughly half to two-thirds with no measured loss of task success, once session-specific values were kept out of the gist; in a subsequent tuned, repeated serving benchmark it let the same GPU sustain twice the request rate within a latency objective and delivered 44 percent higher peak throughput, a gain that is incremental over prefix caching and that shrinks as hardware headroom grows, which makes gisting a cost lever (a cheaper GPU with the gist matched a more expensive one on throughput per dollar) rather than a speed lever; what we have not shown is that task behaviour holds on work we did not design.</w:t>
+        <w:t xml:space="preserve"> at serving time, first in a single replay and then in a tuned, repeated benchmark on two GPU classes, and we report two experiments that our own evaluation harness left unscorable. The detailed numbers and their limits are in the body; here we say only that they motivate further work rather than settle it. Because every result is a single run of small, partly reused, hand-built tasks, we present this as a development study rather than a validated benchmark, with an independent adversarial review of the whole program reconciled into it. The short version, within those limits: the method cut the tokens the model reads each turn by roughly half to two-thirds with no measured loss of task success, once session-specific values were kept out of the gist; in a subsequent tuned, repeated serving benchmark it let the same GPU sustain twice the request rate within a latency objective and delivered 44 percent higher peak throughput, a finite-window replay result incremental over prefix caching whose mechanism and deployment cost implications remain unestablished; what we have not shown is that task behaviour holds on work we did not design.</w:t>
       </w:r>
     </w:p>
     <w:p>
@@ -176,40 +176,55 @@
     </w:p>
     <w:p>
       <w:pPr>
-        <w:pStyle w:val="ListNumber"/>
+        <w:ind w:left="360" w:hanging="360"/>
       </w:pPr>
+      <w:r>
+        <w:t xml:space="preserve">1. </w:t>
+      </w:r>
       <w:r>
         <w:t>A development study applying a frozen-model prompt-distillation recipe [3] to a schema-dominated coding-agent preamble on a hybrid linear-attention model, with the client and serving engine unmodified.</w:t>
       </w:r>
     </w:p>
     <w:p>
       <w:pPr>
-        <w:pStyle w:val="ListNumber"/>
+        <w:ind w:left="360" w:hanging="360"/>
       </w:pPr>
+      <w:r>
+        <w:t xml:space="preserve">2. </w:t>
+      </w:r>
       <w:r>
         <w:t>A deployment recipe whose only trained object is a small embedding tensor: proxy-side span substitution, a conditional chat template, and a sampling mask, requiring no patch to the inference engine.</w:t>
       </w:r>
     </w:p>
     <w:p>
       <w:pPr>
-        <w:pStyle w:val="ListNumber"/>
+        <w:ind w:left="360" w:hanging="360"/>
       </w:pPr>
+      <w:r>
+        <w:t xml:space="preserve">3. </w:t>
+      </w:r>
       <w:r>
         <w:t>An automated, cost-guarded experiment loop (the lab): an unattended controller that provisions a rented GPU, trains a gist, serves it, evaluates it through the same proxy, verifies every turn was swapped, syncs results, and destroys the instance, with structural spend-safety (an idle watchdog, a ledger, and sync-before-destroy). We report the harness faults that invalidated two experiments as candidly as the runs that succeeded, and stress-tested every claim with an independent adversarial review whose findings are reconciled into the paper.</w:t>
       </w:r>
     </w:p>
     <w:p>
       <w:pPr>
-        <w:pStyle w:val="ListNumber"/>
+        <w:ind w:left="360" w:hanging="360"/>
       </w:pPr>
       <w:r>
-        <w:t>A serving benchmark on a tuned server with repeated runs and a latency objective: on a 95 GB H100-class GPU the gist sustains twice the request rate within a p95 latency objective and 44 percent higher peak throughput; the gain is incremental over prefix caching and 2 to 4 times larger without it; and it shrinks as hardware headroom grows, near zero at normal load on a 143 GB GPU, which positions gisting as a cost lever: a cheaper GPU with the gist matched a more expensive GPU without it on throughput per dollar.</w:t>
+        <w:t xml:space="preserve">4. </w:t>
+      </w:r>
+      <w:r>
+        <w:t>A serving benchmark on a tuned server with repeated runs and a latency objective: on a 95 GB H100-class GPU the gist sustains twice the request rate within a p95 latency objective and 44 percent higher peak throughput; the gain is incremental over prefix caching and 2 to 4 times larger without it; the observed peak difference is near zero on a 143 GB GPU. These are finite-window replay observations. J11 invalidates the former H200 hardware-ceiling interpretation, and a consistent quoted-price comparison does not establish cheaper-card substitution.</w:t>
       </w:r>
     </w:p>
     <w:p>
       <w:pPr>
-        <w:pStyle w:val="ListNumber"/>
+        <w:ind w:left="360" w:hanging="360"/>
       </w:pPr>
+      <w:r>
+        <w:t xml:space="preserve">5. </w:t>
+      </w:r>
       <w:r>
         <w:t>A failure mode and its fix: session-specific content (a path with a session identifier) that sample invariance had classified as static was folded into the gist and reconstructed incorrectly, failing path tasks across the four tested ratios; excluding such content from the span by pattern raised an 8:1 gist from 11/16 to 16/16 (11/15 to 15/15 excluding one defective probe) on a hard suite.</w:t>
       </w:r>
@@ -295,12 +310,13 @@
     </w:p>
     <w:p>
       <w:pPr>
+        <w:keepNext/>
         <w:jc w:val="center"/>
       </w:pPr>
       <w:r>
         <w:drawing>
           <wp:inline xmlns:a="http://schemas.openxmlformats.org/drawingml/2006/main" xmlns:pic="http://schemas.openxmlformats.org/drawingml/2006/picture">
-            <wp:extent cx="5760720" cy="1805026"/>
+            <wp:extent cx="5486400" cy="1719072"/>
             <wp:docPr id="1" name="Picture 1"/>
             <wp:cNvGraphicFramePr>
               <a:graphicFrameLocks noChangeAspect="1"/>
@@ -321,7 +337,7 @@
                   <pic:spPr>
                     <a:xfrm>
                       <a:off x="0" y="0"/>
-                      <a:ext cx="5760720" cy="1805026"/>
+                      <a:ext cx="5486400" cy="1719072"/>
                     </a:xfrm>
                     <a:prstGeom prst="rect"/>
                   </pic:spPr>
@@ -386,12 +402,13 @@
     </w:p>
     <w:p>
       <w:pPr>
+        <w:keepNext/>
         <w:jc w:val="center"/>
       </w:pPr>
       <w:r>
         <w:drawing>
           <wp:inline xmlns:a="http://schemas.openxmlformats.org/drawingml/2006/main" xmlns:pic="http://schemas.openxmlformats.org/drawingml/2006/picture">
-            <wp:extent cx="5760720" cy="2457907"/>
+            <wp:extent cx="5486400" cy="2340864"/>
             <wp:docPr id="2" name="Picture 2"/>
             <wp:cNvGraphicFramePr>
               <a:graphicFrameLocks noChangeAspect="1"/>
@@ -412,7 +429,7 @@
                   <pic:spPr>
                     <a:xfrm>
                       <a:off x="0" y="0"/>
-                      <a:ext cx="5760720" cy="2457907"/>
+                      <a:ext cx="5486400" cy="2340864"/>
                     </a:xfrm>
                     <a:prstGeom prst="rect"/>
                   </pic:spPr>
@@ -520,12 +537,13 @@
     </w:p>
     <w:p>
       <w:pPr>
+        <w:keepNext/>
         <w:jc w:val="center"/>
       </w:pPr>
       <w:r>
         <w:drawing>
           <wp:inline xmlns:a="http://schemas.openxmlformats.org/drawingml/2006/main" xmlns:pic="http://schemas.openxmlformats.org/drawingml/2006/picture">
-            <wp:extent cx="5760720" cy="1805026"/>
+            <wp:extent cx="5486400" cy="1719072"/>
             <wp:docPr id="3" name="Picture 3"/>
             <wp:cNvGraphicFramePr>
               <a:graphicFrameLocks noChangeAspect="1"/>
@@ -546,7 +564,7 @@
                   <pic:spPr>
                     <a:xfrm>
                       <a:off x="0" y="0"/>
-                      <a:ext cx="5760720" cy="1805026"/>
+                      <a:ext cx="5486400" cy="1719072"/>
                     </a:xfrm>
                     <a:prstGeom prst="rect"/>
                   </pic:spPr>
@@ -698,12 +716,13 @@
     </w:p>
     <w:p>
       <w:pPr>
+        <w:keepNext/>
         <w:jc w:val="center"/>
       </w:pPr>
       <w:r>
         <w:drawing>
           <wp:inline xmlns:a="http://schemas.openxmlformats.org/drawingml/2006/main" xmlns:pic="http://schemas.openxmlformats.org/drawingml/2006/picture">
-            <wp:extent cx="5760720" cy="1965422"/>
+            <wp:extent cx="5486400" cy="1871831"/>
             <wp:docPr id="4" name="Picture 4"/>
             <wp:cNvGraphicFramePr>
               <a:graphicFrameLocks noChangeAspect="1"/>
@@ -724,7 +743,7 @@
                   <pic:spPr>
                     <a:xfrm>
                       <a:off x="0" y="0"/>
-                      <a:ext cx="5760720" cy="1965422"/>
+                      <a:ext cx="5486400" cy="1871831"/>
                     </a:xfrm>
                     <a:prstGeom prst="rect"/>
                   </pic:spPr>
@@ -765,6 +784,10 @@
         <w:gridCol w:w="1728"/>
       </w:tblGrid>
       <w:tr>
+        <w:trPr>
+          <w:cantSplit/>
+          <w:tblHeader/>
+        </w:trPr>
         <w:tc>
           <w:tcPr>
             <w:tcW w:type="dxa" w:w="1728"/>
@@ -842,6 +865,9 @@
         </w:tc>
       </w:tr>
       <w:tr>
+        <w:trPr>
+          <w:cantSplit/>
+        </w:trPr>
         <w:tc>
           <w:tcPr>
             <w:tcW w:type="dxa" w:w="1728"/>
@@ -914,6 +940,9 @@
         </w:tc>
       </w:tr>
       <w:tr>
+        <w:trPr>
+          <w:cantSplit/>
+        </w:trPr>
         <w:tc>
           <w:tcPr>
             <w:tcW w:type="dxa" w:w="1728"/>
@@ -986,6 +1015,9 @@
         </w:tc>
       </w:tr>
       <w:tr>
+        <w:trPr>
+          <w:cantSplit/>
+        </w:trPr>
         <w:tc>
           <w:tcPr>
             <w:tcW w:type="dxa" w:w="1728"/>
@@ -1058,6 +1090,9 @@
         </w:tc>
       </w:tr>
       <w:tr>
+        <w:trPr>
+          <w:cantSplit/>
+        </w:trPr>
         <w:tc>
           <w:tcPr>
             <w:tcW w:type="dxa" w:w="1728"/>
@@ -1169,12 +1204,13 @@
     </w:p>
     <w:p>
       <w:pPr>
+        <w:keepNext/>
         <w:jc w:val="center"/>
       </w:pPr>
       <w:r>
         <w:drawing>
           <wp:inline xmlns:a="http://schemas.openxmlformats.org/drawingml/2006/main" xmlns:pic="http://schemas.openxmlformats.org/drawingml/2006/picture">
-            <wp:extent cx="5760720" cy="2067951"/>
+            <wp:extent cx="5486400" cy="1969477"/>
             <wp:docPr id="5" name="Picture 5"/>
             <wp:cNvGraphicFramePr>
               <a:graphicFrameLocks noChangeAspect="1"/>
@@ -1195,7 +1231,7 @@
                   <pic:spPr>
                     <a:xfrm>
                       <a:off x="0" y="0"/>
-                      <a:ext cx="5760720" cy="2067951"/>
+                      <a:ext cx="5486400" cy="1969477"/>
                     </a:xfrm>
                     <a:prstGeom prst="rect"/>
                   </pic:spPr>
@@ -1302,12 +1338,13 @@
     </w:p>
     <w:p>
       <w:pPr>
+        <w:keepNext/>
         <w:jc w:val="center"/>
       </w:pPr>
       <w:r>
         <w:drawing>
           <wp:inline xmlns:a="http://schemas.openxmlformats.org/drawingml/2006/main" xmlns:pic="http://schemas.openxmlformats.org/drawingml/2006/picture">
-            <wp:extent cx="5760720" cy="1487658"/>
+            <wp:extent cx="5486400" cy="1416818"/>
             <wp:docPr id="6" name="Picture 6"/>
             <wp:cNvGraphicFramePr>
               <a:graphicFrameLocks noChangeAspect="1"/>
@@ -1328,7 +1365,7 @@
                   <pic:spPr>
                     <a:xfrm>
                       <a:off x="0" y="0"/>
-                      <a:ext cx="5760720" cy="1487658"/>
+                      <a:ext cx="5486400" cy="1416818"/>
                     </a:xfrm>
                     <a:prstGeom prst="rect"/>
                   </pic:spPr>
@@ -1387,6 +1424,10 @@
         <w:gridCol w:w="4320"/>
       </w:tblGrid>
       <w:tr>
+        <w:trPr>
+          <w:cantSplit/>
+          <w:tblHeader/>
+        </w:trPr>
         <w:tc>
           <w:tcPr>
             <w:tcW w:type="dxa" w:w="4320"/>
@@ -1419,6 +1460,9 @@
         </w:tc>
       </w:tr>
       <w:tr>
+        <w:trPr>
+          <w:cantSplit/>
+        </w:trPr>
         <w:tc>
           <w:tcPr>
             <w:tcW w:type="dxa" w:w="4320"/>
@@ -1449,6 +1493,9 @@
         </w:tc>
       </w:tr>
       <w:tr>
+        <w:trPr>
+          <w:cantSplit/>
+        </w:trPr>
         <w:tc>
           <w:tcPr>
             <w:tcW w:type="dxa" w:w="4320"/>
@@ -1479,6 +1526,9 @@
         </w:tc>
       </w:tr>
       <w:tr>
+        <w:trPr>
+          <w:cantSplit/>
+        </w:trPr>
         <w:tc>
           <w:tcPr>
             <w:tcW w:type="dxa" w:w="4320"/>
@@ -1509,6 +1559,9 @@
         </w:tc>
       </w:tr>
       <w:tr>
+        <w:trPr>
+          <w:cantSplit/>
+        </w:trPr>
         <w:tc>
           <w:tcPr>
             <w:tcW w:type="dxa" w:w="4320"/>
@@ -1539,6 +1592,9 @@
         </w:tc>
       </w:tr>
       <w:tr>
+        <w:trPr>
+          <w:cantSplit/>
+        </w:trPr>
         <w:tc>
           <w:tcPr>
             <w:tcW w:type="dxa" w:w="4320"/>
@@ -1569,6 +1625,9 @@
         </w:tc>
       </w:tr>
       <w:tr>
+        <w:trPr>
+          <w:cantSplit/>
+        </w:trPr>
         <w:tc>
           <w:tcPr>
             <w:tcW w:type="dxa" w:w="4320"/>
@@ -1599,6 +1658,9 @@
         </w:tc>
       </w:tr>
       <w:tr>
+        <w:trPr>
+          <w:cantSplit/>
+        </w:trPr>
         <w:tc>
           <w:tcPr>
             <w:tcW w:type="dxa" w:w="4320"/>
@@ -1629,6 +1691,9 @@
         </w:tc>
       </w:tr>
       <w:tr>
+        <w:trPr>
+          <w:cantSplit/>
+        </w:trPr>
         <w:tc>
           <w:tcPr>
             <w:tcW w:type="dxa" w:w="4320"/>
@@ -1682,12 +1747,13 @@
     </w:p>
     <w:p>
       <w:pPr>
+        <w:keepNext/>
         <w:jc w:val="center"/>
       </w:pPr>
       <w:r>
         <w:drawing>
           <wp:inline xmlns:a="http://schemas.openxmlformats.org/drawingml/2006/main" xmlns:pic="http://schemas.openxmlformats.org/drawingml/2006/picture">
-            <wp:extent cx="5760720" cy="2235503"/>
+            <wp:extent cx="5486400" cy="2129051"/>
             <wp:docPr id="7" name="Picture 7"/>
             <wp:cNvGraphicFramePr>
               <a:graphicFrameLocks noChangeAspect="1"/>
@@ -1708,7 +1774,7 @@
                   <pic:spPr>
                     <a:xfrm>
                       <a:off x="0" y="0"/>
-                      <a:ext cx="5760720" cy="2235503"/>
+                      <a:ext cx="5486400" cy="2129051"/>
                     </a:xfrm>
                     <a:prstGeom prst="rect"/>
                   </pic:spPr>
@@ -1812,6 +1878,10 @@
         <w:gridCol w:w="1728"/>
       </w:tblGrid>
       <w:tr>
+        <w:trPr>
+          <w:cantSplit/>
+          <w:tblHeader/>
+        </w:trPr>
         <w:tc>
           <w:tcPr>
             <w:tcW w:type="dxa" w:w="1728"/>
@@ -1889,6 +1959,9 @@
         </w:tc>
       </w:tr>
       <w:tr>
+        <w:trPr>
+          <w:cantSplit/>
+        </w:trPr>
         <w:tc>
           <w:tcPr>
             <w:tcW w:type="dxa" w:w="1728"/>
@@ -1961,6 +2034,9 @@
         </w:tc>
       </w:tr>
       <w:tr>
+        <w:trPr>
+          <w:cantSplit/>
+        </w:trPr>
         <w:tc>
           <w:tcPr>
             <w:tcW w:type="dxa" w:w="1728"/>
@@ -2033,6 +2109,9 @@
         </w:tc>
       </w:tr>
       <w:tr>
+        <w:trPr>
+          <w:cantSplit/>
+        </w:trPr>
         <w:tc>
           <w:tcPr>
             <w:tcW w:type="dxa" w:w="1728"/>
@@ -2105,6 +2184,9 @@
         </w:tc>
       </w:tr>
       <w:tr>
+        <w:trPr>
+          <w:cantSplit/>
+        </w:trPr>
         <w:tc>
           <w:tcPr>
             <w:tcW w:type="dxa" w:w="1728"/>
@@ -2177,6 +2259,9 @@
         </w:tc>
       </w:tr>
       <w:tr>
+        <w:trPr>
+          <w:cantSplit/>
+        </w:trPr>
         <w:tc>
           <w:tcPr>
             <w:tcW w:type="dxa" w:w="1728"/>
@@ -2276,12 +2361,13 @@
     </w:p>
     <w:p>
       <w:pPr>
+        <w:keepNext/>
         <w:jc w:val="center"/>
       </w:pPr>
       <w:r>
         <w:drawing>
           <wp:inline xmlns:a="http://schemas.openxmlformats.org/drawingml/2006/main" xmlns:pic="http://schemas.openxmlformats.org/drawingml/2006/picture">
-            <wp:extent cx="5760720" cy="1735602"/>
+            <wp:extent cx="5486400" cy="1652954"/>
             <wp:docPr id="8" name="Picture 8"/>
             <wp:cNvGraphicFramePr>
               <a:graphicFrameLocks noChangeAspect="1"/>
@@ -2302,7 +2388,7 @@
                   <pic:spPr>
                     <a:xfrm>
                       <a:off x="0" y="0"/>
-                      <a:ext cx="5760720" cy="1735602"/>
+                      <a:ext cx="5486400" cy="1652954"/>
                     </a:xfrm>
                     <a:prstGeom prst="rect"/>
                   </pic:spPr>
@@ -2341,6 +2427,10 @@
         <w:gridCol w:w="2880"/>
       </w:tblGrid>
       <w:tr>
+        <w:trPr>
+          <w:cantSplit/>
+          <w:tblHeader/>
+        </w:trPr>
         <w:tc>
           <w:tcPr>
             <w:tcW w:type="dxa" w:w="2880"/>
@@ -2388,6 +2478,9 @@
         </w:tc>
       </w:tr>
       <w:tr>
+        <w:trPr>
+          <w:cantSplit/>
+        </w:trPr>
         <w:tc>
           <w:tcPr>
             <w:tcW w:type="dxa" w:w="2880"/>
@@ -2432,6 +2525,9 @@
         </w:tc>
       </w:tr>
       <w:tr>
+        <w:trPr>
+          <w:cantSplit/>
+        </w:trPr>
         <w:tc>
           <w:tcPr>
             <w:tcW w:type="dxa" w:w="2880"/>
@@ -2476,6 +2572,9 @@
         </w:tc>
       </w:tr>
       <w:tr>
+        <w:trPr>
+          <w:cantSplit/>
+        </w:trPr>
         <w:tc>
           <w:tcPr>
             <w:tcW w:type="dxa" w:w="2880"/>
@@ -2520,6 +2619,9 @@
         </w:tc>
       </w:tr>
       <w:tr>
+        <w:trPr>
+          <w:cantSplit/>
+        </w:trPr>
         <w:tc>
           <w:tcPr>
             <w:tcW w:type="dxa" w:w="2880"/>
@@ -2599,37 +2701,28 @@
         <w:rPr>
           <w:b/>
         </w:rPr>
-        <w:t>The result to watch.</w:t>
+        <w:t>Finite-window replay results.</w:t>
       </w:r>
       <w:r>
-        <w:t xml:space="preserve"> For a self-hosted agent that serves many developers from one GPU pool, the number that decides cost is how many sessions a GPU can carry at once within an acceptable latency, not how quickly a single reply returns. In a tuned, repeated benchmark on the paper’s hardware class, the gist let the same GPU sustain </w:t>
+        <w:t xml:space="preserve"> On the H100-class GPU, the J10 replay recorded </w:t>
       </w:r>
       <w:r>
         <w:rPr>
           <w:b/>
         </w:rPr>
-        <w:t>twice the request rate</w:t>
+        <w:t>twice the target request rate</w:t>
       </w:r>
       <w:r>
-        <w:t xml:space="preserve"> within a p95 latency objective (about 18 to 36 requests per minute) and delivered </w:t>
+        <w:t xml:space="preserve"> passing the chosen p95 latency criterion (18 versus 36 requests per minute) and </w:t>
       </w:r>
       <w:r>
         <w:rPr>
           <w:b/>
         </w:rPr>
-        <w:t>44 percent higher peak throughput</w:t>
+        <w:t>44 percent higher observed peak throughput</w:t>
       </w:r>
       <w:r>
-        <w:t xml:space="preserve"> (42.7 to 61.3 requests per minute). The gain is incremental over prefix caching, and 2 to 4.4 times larger when caching cannot help. It is not a speed lever: a single reply is barely faster, and on a larger GPU with memory to spare the peak gain disappears at normal load. It is a </w:t>
-      </w:r>
-      <w:r>
-        <w:rPr>
-          <w:b/>
-        </w:rPr>
-        <w:t>cost lever</w:t>
-      </w:r>
-      <w:r>
-        <w:t>: a cheaper GPU running the gist matched a more expensive GPU running the full prompt on throughput per dollar.</w:t>
+        <w:t xml:space="preserve"> (42.7 versus 61.3 requests per minute; unrounded gain 43.75 percent). These are finite-window replay measurements on one hardware class, with fixed 200-token outputs. The mechanism behind the throughput difference is not established, and these measurements do not establish deployment capacity or savings per successful coding task. The advantage was observed with prefix caching enabled; cache-off ratios at 4, 8 and 16 concurrent requests were 2.00, 2.48 and 4.39. The J11 connection-limit correction does not invalidate these lower-concurrency measurements; the other findings of the second review remain open.</w:t>
       </w:r>
     </w:p>
     <w:p>
@@ -2640,17 +2733,18 @@
         <w:t>Benchmark.</w:t>
       </w:r>
       <w:r>
-        <w:t xml:space="preserve"> A first fixed-concurrency replay on the paper’s original server configuration (131k context, 64 sequences, 0.80 memory utilisation, 4k batched tokens) showed the gist 12 to 16 percent ahead at eight concurrent sessions. Because that configuration throttles the server, we then ran a dedicated benchmark. The vLLM configuration was tuned by throughput at fixed load (context sized to the workload at 40,960 tokens, 256 sequences, 0.92 utilisation, 16k batched tokens) and applied identically to both arms. The workload is 198 turn-ordered requests per arm from 24 logged sessions (median full prompt 26,169 tokens, gist 10,998), each generating exactly 200 tokens; time to first token is measured from the first content token and cross-checked against engine counters, resolving the measurement caveat of the earlier replay. Four measurements follow: a closed-loop concurrency sweep to saturation (three repeats, balanced arm order), open-loop Poisson arrivals at rising rates (two repeats), a prefix-cache ablation, and a resident-sequence probe; the sweep was repeated on an H200 NVL (143 GB) with the same configuration (two repeats). All 201 runs completed without error.</w:t>
+        <w:t xml:space="preserve"> A first fixed-concurrency replay on the paper’s original server configuration (131k context, 64 sequences, 0.80 memory utilisation, 4k batched tokens) showed the gist 12 to 16 percent ahead at eight concurrent sessions. Because that configuration throttles the server, we then ran a dedicated benchmark. The vLLM configuration was tuned by throughput at fixed load (context sized to the workload at 40,960 tokens, 256 sequences, 0.92 utilisation, 16k batched tokens) and applied identically to both arms. The workload is 198 turn-ordered requests per arm from 24 logged sessions (median full prompt 26,169 tokens, gist 10,998), each generating exactly 200 tokens; time to first token is measured from the first content token and cross-checked against engine counters, resolving the measurement caveat of the earlier replay. Five measurements are reported: a closed-loop concurrency sweep to saturation (three repeats, balanced arm order), open-loop Poisson arrivals at rising rates (two repeats), a prefix-cache ablation, and a resident-sequence probe, followed by a separate connection-limit control (J11) correcting that probe; the J10 sweep was repeated on an H200 NVL (143 GB) with the same configuration (two repeats). The external reviewer verified 202 archived J10 runs with zero recorded request errors. J11 adds eight separate H200 runs, one per condition, also with zero recorded request errors. It varies the client connection cap (100 or 512), prompt arm, and offered concurrency (128 or 256), using a 30-second warm-up and a 180-second request-start measurement window.</w:t>
       </w:r>
     </w:p>
     <w:p>
       <w:pPr>
+        <w:keepNext/>
         <w:jc w:val="center"/>
       </w:pPr>
       <w:r>
         <w:drawing>
           <wp:inline xmlns:a="http://schemas.openxmlformats.org/drawingml/2006/main" xmlns:pic="http://schemas.openxmlformats.org/drawingml/2006/picture">
-            <wp:extent cx="5760720" cy="2033195"/>
+            <wp:extent cx="5486400" cy="1936376"/>
             <wp:docPr id="9" name="Picture 9"/>
             <wp:cNvGraphicFramePr>
               <a:graphicFrameLocks noChangeAspect="1"/>
@@ -2671,7 +2765,7 @@
                   <pic:spPr>
                     <a:xfrm>
                       <a:off x="0" y="0"/>
-                      <a:ext cx="5760720" cy="2033195"/>
+                      <a:ext cx="5486400" cy="1936376"/>
                     </a:xfrm>
                     <a:prstGeom prst="rect"/>
                   </pic:spPr>
@@ -2694,7 +2788,7 @@
         <w:rPr>
           <w:sz w:val="18"/>
         </w:rPr>
-        <w:t xml:space="preserve"> Serving benchmark on the tuned server (H100 NVL 95 GB). Left: throughput against concurrent sessions for the full prompt, the 8:1 gist, and the 16:1 gist; the full prompt collapses beyond 32 sessions as its KV cache fills, the 8:1 gist peaks at 32 with 44 percent higher throughput, and 16:1 sits between. Right: p95 end-to-end latency against offered load under Poisson arrivals; within the 2x latency objective the full prompt sustains about 18 requests per minute and the gist about 36. Repeat-to-repeat spread is within marker size.</w:t>
+        <w:t xml:space="preserve"> Finite-window J10 serving replay on the selected H100 NVL configuration (95 GB). The plotted concurrency range is restricted to 1 through 64, below the client connection cap; the client-limited higher-concurrency points are not shown. Left: observed throughput for the full prompt, 8:1 gist and 16:1 gist. The 8:1 gist peaks at 32 with 43.75 percent higher throughput than the observed full-prompt peak. These curves do not establish a residency mechanism. Right: p95 end-to-end latency against target Poisson arrival rate; target rates of 18 and 36 requests per minute pass the respective arm-relative 2x criterion. J11 does not invalidate these lower-concurrency figures; the second review's other measurement qualifications remain open.</w:t>
       </w:r>
     </w:p>
     <w:tbl>
@@ -2713,6 +2807,10 @@
         <w:gridCol w:w="1440"/>
       </w:tblGrid>
       <w:tr>
+        <w:trPr>
+          <w:cantSplit/>
+          <w:tblHeader/>
+        </w:trPr>
         <w:tc>
           <w:tcPr>
             <w:tcW w:type="dxa" w:w="1440"/>
@@ -2805,6 +2903,9 @@
         </w:tc>
       </w:tr>
       <w:tr>
+        <w:trPr>
+          <w:cantSplit/>
+        </w:trPr>
         <w:tc>
           <w:tcPr>
             <w:tcW w:type="dxa" w:w="1440"/>
@@ -2891,6 +2992,9 @@
         </w:tc>
       </w:tr>
       <w:tr>
+        <w:trPr>
+          <w:cantSplit/>
+        </w:trPr>
         <w:tc>
           <w:tcPr>
             <w:tcW w:type="dxa" w:w="1440"/>
@@ -2977,6 +3081,9 @@
         </w:tc>
       </w:tr>
       <w:tr>
+        <w:trPr>
+          <w:cantSplit/>
+        </w:trPr>
         <w:tc>
           <w:tcPr>
             <w:tcW w:type="dxa" w:w="1440"/>
@@ -3063,6 +3170,9 @@
         </w:tc>
       </w:tr>
       <w:tr>
+        <w:trPr>
+          <w:cantSplit/>
+        </w:trPr>
         <w:tc>
           <w:tcPr>
             <w:tcW w:type="dxa" w:w="1440"/>
@@ -3149,6 +3259,9 @@
         </w:tc>
       </w:tr>
       <w:tr>
+        <w:trPr>
+          <w:cantSplit/>
+        </w:trPr>
         <w:tc>
           <w:tcPr>
             <w:tcW w:type="dxa" w:w="1440"/>
@@ -3235,6 +3348,9 @@
         </w:tc>
       </w:tr>
       <w:tr>
+        <w:trPr>
+          <w:cantSplit/>
+        </w:trPr>
         <w:tc>
           <w:tcPr>
             <w:tcW w:type="dxa" w:w="1440"/>
@@ -3321,6 +3437,9 @@
         </w:tc>
       </w:tr>
       <w:tr>
+        <w:trPr>
+          <w:cantSplit/>
+        </w:trPr>
         <w:tc>
           <w:tcPr>
             <w:tcW w:type="dxa" w:w="1440"/>
@@ -3407,6 +3526,9 @@
         </w:tc>
       </w:tr>
       <w:tr>
+        <w:trPr>
+          <w:cantSplit/>
+        </w:trPr>
         <w:tc>
           <w:tcPr>
             <w:tcW w:type="dxa" w:w="1440"/>
@@ -3499,7 +3621,7 @@
           <w:color w:val="565B62"/>
           <w:sz w:val="18"/>
         </w:rPr>
-        <w:t>Table 4. Closed-loop sweep on the tuned server, mean of three repeats (two for 16:1); repeat-to-repeat standard deviation is at most 0.6 requests per minute at every point shown. Peak throughput: full prompt 42.7 at 16 sessions, 8:1 gist 61.3 at 32 (+44 percent), 16:1 gist 54.0 at 32 (+27 percent). Beyond 32 sessions the full prompt’s KV cache is full and its throughput falls to 29; the gist’s decline begins at 64. Sessions within a p95 objective of 2x, 3x, or 4x the unloaded median are quantised by the powers-of-two ladder and tie between arms (2, 4, 8); at 6x the gist holds 16 to the full prompt’s 8. The open-loop measurement (Table 5) resolves the objective without that quantisation.</w:t>
+        <w:t>Table 4. Closed-loop sweep on the tuned server, mean of three repeats (two for 16:1); repeat-to-repeat population standard deviation is at most 1.34 requests per minute across the points shown (at most 0.67 for the 8:1 and full-prompt arms), so adjacent points on this ladder are not always separable. Peak throughput: full prompt 42.7 at 16 sessions, 8:1 gist 61.3 at 32 (+44 percent), 16:1 gist 54.0 at 32 (+27 percent). Beyond 32 sessions the full prompt’s KV cache is full and its throughput falls to 29; the gist’s decline begins at 64. Sessions within a p95 objective of 2x, 3x, or 4x the unloaded median are quantised by the powers-of-two ladder and tie between arms (2, 4, 8); at 6x the gist holds 16 to the full prompt’s 8. The open-loop measurement (Table 5) resolves the objective without that quantisation.</w:t>
       </w:r>
     </w:p>
     <w:tbl>
@@ -3517,6 +3639,10 @@
         <w:gridCol w:w="1728"/>
       </w:tblGrid>
       <w:tr>
+        <w:trPr>
+          <w:cantSplit/>
+          <w:tblHeader/>
+        </w:trPr>
         <w:tc>
           <w:tcPr>
             <w:tcW w:type="dxa" w:w="1728"/>
@@ -3594,6 +3720,9 @@
         </w:tc>
       </w:tr>
       <w:tr>
+        <w:trPr>
+          <w:cantSplit/>
+        </w:trPr>
         <w:tc>
           <w:tcPr>
             <w:tcW w:type="dxa" w:w="1728"/>
@@ -3666,6 +3795,9 @@
         </w:tc>
       </w:tr>
       <w:tr>
+        <w:trPr>
+          <w:cantSplit/>
+        </w:trPr>
         <w:tc>
           <w:tcPr>
             <w:tcW w:type="dxa" w:w="1728"/>
@@ -3738,6 +3870,9 @@
         </w:tc>
       </w:tr>
       <w:tr>
+        <w:trPr>
+          <w:cantSplit/>
+        </w:trPr>
         <w:tc>
           <w:tcPr>
             <w:tcW w:type="dxa" w:w="1728"/>
@@ -3810,6 +3945,9 @@
         </w:tc>
       </w:tr>
       <w:tr>
+        <w:trPr>
+          <w:cantSplit/>
+        </w:trPr>
         <w:tc>
           <w:tcPr>
             <w:tcW w:type="dxa" w:w="1728"/>
@@ -3882,6 +4020,9 @@
         </w:tc>
       </w:tr>
       <w:tr>
+        <w:trPr>
+          <w:cantSplit/>
+        </w:trPr>
         <w:tc>
           <w:tcPr>
             <w:tcW w:type="dxa" w:w="1728"/>
@@ -3954,6 +4095,9 @@
         </w:tc>
       </w:tr>
       <w:tr>
+        <w:trPr>
+          <w:cantSplit/>
+        </w:trPr>
         <w:tc>
           <w:tcPr>
             <w:tcW w:type="dxa" w:w="1728"/>
@@ -4052,6 +4196,10 @@
         <w:gridCol w:w="1234"/>
       </w:tblGrid>
       <w:tr>
+        <w:trPr>
+          <w:cantSplit/>
+          <w:tblHeader/>
+        </w:trPr>
         <w:tc>
           <w:tcPr>
             <w:tcW w:type="dxa" w:w="1234"/>
@@ -4159,6 +4307,9 @@
         </w:tc>
       </w:tr>
       <w:tr>
+        <w:trPr>
+          <w:cantSplit/>
+        </w:trPr>
         <w:tc>
           <w:tcPr>
             <w:tcW w:type="dxa" w:w="1234"/>
@@ -4259,6 +4410,9 @@
         </w:tc>
       </w:tr>
       <w:tr>
+        <w:trPr>
+          <w:cantSplit/>
+        </w:trPr>
         <w:tc>
           <w:tcPr>
             <w:tcW w:type="dxa" w:w="1234"/>
@@ -4359,6 +4513,9 @@
         </w:tc>
       </w:tr>
       <w:tr>
+        <w:trPr>
+          <w:cantSplit/>
+        </w:trPr>
         <w:tc>
           <w:tcPr>
             <w:tcW w:type="dxa" w:w="1234"/>
@@ -4473,10 +4630,20 @@
         <w:rPr>
           <w:b/>
         </w:rPr>
-        <w:t>Where the capacity comes from.</w:t>
+        <w:t>Correction to the residency interpretation.</w:t>
       </w:r>
       <w:r>
-        <w:t xml:space="preserve"> Driving both arms at 256 offered sessions, the H100 kept at most 54 full-prompt and 66 gist sequences resident with the KV cache full in both cases; the H200 kept exactly 100 resident in both arms with the KV cache only 83 percent full and no preemptions. The resident-session ceiling on this hybrid model is therefore set by the recurrent-state cache, whose per-sequence cost does not depend on prompt length, not by the KV cache the prompt occupies. The gist raises throughput mainly by faster turnover per session (about 60 percent less prefill work and lower KV pressure) and only secondarily by fitting more sessions; at the H200 ceiling it served 85.5 requests per minute to the full prompt’s 50.0 with the same 100 sequences resident. This refines the mechanism stated in the first version of this paper.</w:t>
+        <w:t xml:space="preserve"> We withdrew the original H200 hardware-ceiling interpretation after external review identified a 100-connection limit in our own load generator. The dedicated J11 follow-up raised that limit to 512 and measured maximum sampled residency of 123 to 137 requests, with KV cache maxima of 97.3 to 99.9 percent and preemptions in three of four uncapped runs. These observations are consistent with KV saturation constraining admission under these conditions; they do not isolate the engine allocation mechanism or establish a precise hardware ceiling. At 256 offered requests, the gist reached a sampled maximum of 137 resident requests against 126 for the full prompt, in one run per condition and with preemptions in both. Lifting the limit reduced throughput in three of four comparisons: full at 128, 59.67 to 47.00 rpm; full at 256, 67.33 to 46.33; gist at 256, 88.33 to 56.67. Only gist at 128 increased, from 74.00 to 80.67 rpm. This is consistent with the cap acting as admission control, protecting the engine from overload; the earlier high-concurrency figures are not uniformly conservative. The gist/full ratios at 128 and 256 changed from 1.24 and 1.31 with the cap to 1.72 and 1.22 without it. We report these as observations; the cause of the throughput differences remains unestablished. The J10 H100 sampled residency values of 54 full and 66 gist are below the client cap and survive this correction. J11 used one H200, two offered concurrencies, one run per condition and no quality evaluation; raw evidence is under </w:t>
+      </w:r>
+      <w:r>
+        <w:rPr>
+          <w:rFonts w:ascii="Consolas" w:hAnsi="Consolas"/>
+          <w:sz w:val="18"/>
+        </w:rPr>
+        <w:t>experiments/journeys/j11-conn/</w:t>
+      </w:r>
+      <w:r>
+        <w:t>.</w:t>
       </w:r>
     </w:p>
     <w:p>
@@ -4484,10 +4651,10 @@
         <w:rPr>
           <w:b/>
         </w:rPr>
-        <w:t>The gain depends on hardware headroom, which makes it a cost lever.</w:t>
+        <w:t>Hardware observations and the price comparison.</w:t>
       </w:r>
       <w:r>
-        <w:t xml:space="preserve"> On the H200 NVL with the same configuration, peak throughput was 85.3 requests per minute for the full prompt and 83.3 for the gist (minus 2 percent); the gist was ahead by 4 to 16 percent at low load, behind at 16 sessions (0.81x, reproducible across both repeats and most likely because the configuration was tuned on the H100), ahead by 45 percent at 32, and 3.1 times ahead at 128 sessions where the full prompt collapsed. With more memory and bandwidth the prompt is not the binding cost at normal load, so shrinking it buys little until the server is pushed. Dividing peak throughput by each GPU class’s hourly rental price at the time of the run gives 16.2 requests per minute per dollar-hour for the full prompt on the H100, 23.2 for the gist on the H100, 22.5 for the full prompt on the H200, and 22.0 for the gist on the H200: the gist let the cheaper GPU match the more expensive one. We therefore read gisting as a cost lever whose value is proportional to how memory-constrained the hardware is relative to the prompt, and, for workloads whose prompts do not share prefixes, as a robustness lever that holds on any hardware. Extrapolating the trend, a still larger GPU would show little peak gain at normal load; that is a prediction from the mechanism, not a measurement.</w:t>
+        <w:t xml:space="preserve"> On the H200 NVL with the H100-selected configuration, J10 observed peak throughput of 85.3 requests per minute for the full prompt and 83.3 for the gist (minus 2 percent). The ratios were 0.81 at 16 concurrent requests and 1.45 at 32. The historical ratio of 3.1 at 128 was measured through the capped client and is not an uncapped capacity estimate. Using a consistent quoted rental-price basis, $2.64/h for H100 and $3.65/h for H200, observed peak requests per minute per ($/h) are 16.16 and 23.23 for H100 full and gist, and 23.38 and 22.83 for H200 full and gist. H200 full therefore slightly exceeds H100 gist on this measure. Earlier H200 values of 22.5 and 22.0 used an effective rate inferred from total expense divided by hours, mixed with the quoted H100 rate. The corrected comparison shows approximate equality under these particular prices, not established cheaper-card substitution. Quality at load, equal tuning effort and a common service objective remain necessary for a deployment cost comparison. J11 also shows that removing admission limits can lower throughput, so high-concurrency results cannot be treated as uniformly understated.</w:t>
       </w:r>
     </w:p>
     <w:p>
@@ -4569,10 +4736,10 @@
         <w:rPr>
           <w:b/>
         </w:rPr>
-        <w:t>Architecture and headroom, not prompt length alone, set the benefit.</w:t>
+        <w:t>Architecture and the observations that survive.</w:t>
       </w:r>
       <w:r>
-        <w:t xml:space="preserve"> Full attention runs in 16 of 64 layers; the other 48 fold the prefix into a fixed-size recurrent state. The benchmark showed the consequence directly: the resident-session ceiling is set by the recurrent-state cache, whose cost per sequence is independent of prompt length, so a shorter prompt does not let many more sessions fit; it lets each session finish sooner. That is why the measured gain is throughput and sustainable load rather than single-request latency, why it is largest where memory is tight (the 95 GB card) and smallest where it is not (the 143 GB card at normal load), and why it survives the removal of prefix caching. The layer-mix expectation recorded before measurement pointed in this direction; the benchmark supplies the mechanism.</w:t>
+        <w:t xml:space="preserve"> Full attention runs in 16 of 64 layers; the other 48 fold the prefix into a fixed-size recurrent state. This layer mix motivated an expectation before measurement, but J10 did not confirm it as a residency mechanism, and J11 invalidated the claimed H200 hardware ceiling. The serving observations remain: the measured advantage is primarily requests processed under load, with little single-request latency improvement; the observed peak gain is larger on the memory-constrained H100 than on the H200; and an advantage remains in the H100 cache-off runs. These observations motivate hypotheses about memory pressure and serving cost. They do not establish the cause of the throughput difference or a hardware-independent benefit.</w:t>
       </w:r>
     </w:p>
     <w:p>
@@ -4648,6 +4815,22 @@
       </w:pPr>
       <w:r>
         <w:t>The serving benchmark replays logged turns with fixed 200-token outputs on two GPU classes, three repeats on the H100 class and two on the H200; the concurrency ladder is powers of two, so sessions-within-objective is quantised (the open-loop measurement avoids this); the H200 used a configuration tuned on the H100 and showed one reproducible regression at 16 sessions, so per-hardware tuning is needed before its numbers are compared across cards; and throughput per dollar-hour uses spot rental prices on one day. Time to first token is measured from the first content token and checked against engine counters.</w:t>
+      </w:r>
+    </w:p>
+    <w:p>
+      <w:pPr>
+        <w:pStyle w:val="ListBullet"/>
+      </w:pPr>
+      <w:r>
+        <w:t>Prefix-cache benefit is unequal across prompt arms. Across all eight J11 runs, full-prompt prefix hit rates were 0.791 to 0.840, versus 0.580 to 0.626 for the gist. The higher cached fraction favours the full arm on this metric; its effect on the throughput comparison is not isolated, because token counts and request populations differ. The asymmetry is persistent, appears in J10 too, and was not controlled for in the program. No correction factor is inferred from it.</w:t>
+      </w:r>
+    </w:p>
+    <w:p>
+      <w:pPr>
+        <w:pStyle w:val="ListBullet"/>
+      </w:pPr>
+      <w:r>
+        <w:t>J11 tests one H200 class, two offered concurrencies and one run per condition, with no quality measurement. Residency is a maximum sampled every five seconds, not a precise ceiling. Runs were ordered by connection cap, then arm and concurrency; time and cache history can therefore differ between conditions.</w:t>
       </w:r>
     </w:p>
     <w:p>
@@ -4738,7 +4921,7 @@
     </w:p>
     <w:p>
       <w:r>
-        <w:t>A frozen-model prompt-distillation recipe can be implemented for a schema-dominated coding agent on a self-hosted hybrid model, served without modifying the client or engine, and it achieves a large reduction in input tokens per turn. In single runs on the suites we ran, a one-epoch, embedding-only gist scored equal to the full-prompt model once session-specific content was kept outside the span; whether that reflects behavioural equivalence on unseen work is untested. A tuned, repeated serving benchmark then showed the gist sustaining twice the request rate within a latency objective and 44 percent higher peak throughput on the paper’s hardware class, incremental over prefix caching, with the resident-session ceiling set by the recurrent-state cache rather than by prompt length. The gain shrinks as hardware headroom grows, so in deployment terms gisting is a cost lever: it lets a cheaper GPU match a more expensive one on throughput per dollar, and it protects throughput where prompts do not share prefixes. The open questions, generalisation on an untouched task set, controls that isolate the contribution of training, whether rare-tool reach is capacity-bound, a measured path-fidelity rate, and per-hardware serving tuning, require a rebuilt and validated evaluation harness, which our own negative results identify as the priority.</w:t>
+        <w:t>A frozen-model prompt-distillation recipe can be implemented for a schema-dominated coding agent on a self-hosted hybrid model, served without modifying the client or engine, and it achieves a large reduction in input tokens per turn. In single runs on the suites we ran, a one-epoch, embedding-only gist scored equal to the full-prompt model once session-specific content was kept outside the span; whether that reflects behavioural equivalence on unseen work is untested. A tuned, repeated serving benchmark then showed the gist sustaining twice the request rate within a latency objective and 44 percent higher peak throughput on the paper’s hardware class, incremental over prefix caching. These are finite-window replay observations; their mechanism and deployment economics remain open. J11 withdrew the H200 hardware-ceiling interpretation and found lower throughput after lifting the client cap in three of four comparisons. On consistent quoted prices, H200 full slightly exceeds H100 gist per dollar. Cheaper-card substitution is not established. The open questions, generalisation on an untouched task set, controls that isolate the contribution of training, whether rare-tool reach is capacity-bound, a measured path-fidelity rate, and per-hardware serving tuning, require a rebuilt and validated evaluation harness, which our own negative results identify as the priority.</w:t>
       </w:r>
     </w:p>
     <w:p>
@@ -4771,6 +4954,10 @@
         <w:gridCol w:w="2160"/>
       </w:tblGrid>
       <w:tr>
+        <w:trPr>
+          <w:cantSplit/>
+          <w:tblHeader/>
+        </w:trPr>
         <w:tc>
           <w:tcPr>
             <w:tcW w:type="dxa" w:w="2160"/>
@@ -4833,6 +5020,9 @@
         </w:tc>
       </w:tr>
       <w:tr>
+        <w:trPr>
+          <w:cantSplit/>
+        </w:trPr>
         <w:tc>
           <w:tcPr>
             <w:tcW w:type="dxa" w:w="2160"/>
@@ -4891,6 +5081,9 @@
         </w:tc>
       </w:tr>
       <w:tr>
+        <w:trPr>
+          <w:cantSplit/>
+        </w:trPr>
         <w:tc>
           <w:tcPr>
             <w:tcW w:type="dxa" w:w="2160"/>
@@ -4949,6 +5142,9 @@
         </w:tc>
       </w:tr>
       <w:tr>
+        <w:trPr>
+          <w:cantSplit/>
+        </w:trPr>
         <w:tc>
           <w:tcPr>
             <w:tcW w:type="dxa" w:w="2160"/>
@@ -5007,6 +5203,9 @@
         </w:tc>
       </w:tr>
       <w:tr>
+        <w:trPr>
+          <w:cantSplit/>
+        </w:trPr>
         <w:tc>
           <w:tcPr>
             <w:tcW w:type="dxa" w:w="2160"/>
@@ -5065,6 +5264,9 @@
         </w:tc>
       </w:tr>
       <w:tr>
+        <w:trPr>
+          <w:cantSplit/>
+        </w:trPr>
         <w:tc>
           <w:tcPr>
             <w:tcW w:type="dxa" w:w="2160"/>
@@ -5123,6 +5325,9 @@
         </w:tc>
       </w:tr>
       <w:tr>
+        <w:trPr>
+          <w:cantSplit/>
+        </w:trPr>
         <w:tc>
           <w:tcPr>
             <w:tcW w:type="dxa" w:w="2160"/>
@@ -5181,6 +5386,9 @@
         </w:tc>
       </w:tr>
       <w:tr>
+        <w:trPr>
+          <w:cantSplit/>
+        </w:trPr>
         <w:tc>
           <w:tcPr>
             <w:tcW w:type="dxa" w:w="2160"/>
@@ -5239,6 +5447,9 @@
         </w:tc>
       </w:tr>
       <w:tr>
+        <w:trPr>
+          <w:cantSplit/>
+        </w:trPr>
         <w:tc>
           <w:tcPr>
             <w:tcW w:type="dxa" w:w="2160"/>
@@ -5297,6 +5508,9 @@
         </w:tc>
       </w:tr>
       <w:tr>
+        <w:trPr>
+          <w:cantSplit/>
+        </w:trPr>
         <w:tc>
           <w:tcPr>
             <w:tcW w:type="dxa" w:w="2160"/>
@@ -5355,6 +5569,9 @@
         </w:tc>
       </w:tr>
       <w:tr>
+        <w:trPr>
+          <w:cantSplit/>
+        </w:trPr>
         <w:tc>
           <w:tcPr>
             <w:tcW w:type="dxa" w:w="2160"/>
@@ -5413,6 +5630,9 @@
         </w:tc>
       </w:tr>
       <w:tr>
+        <w:trPr>
+          <w:cantSplit/>
+        </w:trPr>
         <w:tc>
           <w:tcPr>
             <w:tcW w:type="dxa" w:w="2160"/>
@@ -5471,6 +5691,9 @@
         </w:tc>
       </w:tr>
       <w:tr>
+        <w:trPr>
+          <w:cantSplit/>
+        </w:trPr>
         <w:tc>
           <w:tcPr>
             <w:tcW w:type="dxa" w:w="2160"/>
@@ -5509,7 +5732,7 @@
               <w:rPr>
                 <w:sz w:val="17"/>
               </w:rPr>
-              <w:t>peak -2%; 3.1x at 128 sessions; per-dollar parity with H100+gist</w:t>
+              <w:t>peak -2%; historical 3.1x at 128 through capped client; quoted-price comparison corrected</w:t>
             </w:r>
           </w:p>
         </w:tc>
@@ -5528,6 +5751,67 @@
           </w:p>
         </w:tc>
       </w:tr>
+      <w:tr>
+        <w:trPr>
+          <w:cantSplit/>
+        </w:trPr>
+        <w:tc>
+          <w:tcPr>
+            <w:tcW w:type="dxa" w:w="2160"/>
+          </w:tcPr>
+          <w:p>
+            <w:r/>
+            <w:r>
+              <w:rPr>
+                <w:sz w:val="17"/>
+              </w:rPr>
+              <w:t>J11</w:t>
+            </w:r>
+          </w:p>
+        </w:tc>
+        <w:tc>
+          <w:tcPr>
+            <w:tcW w:type="dxa" w:w="2160"/>
+          </w:tcPr>
+          <w:p>
+            <w:r/>
+            <w:r>
+              <w:rPr>
+                <w:sz w:val="17"/>
+              </w:rPr>
+              <w:t>Connection-limit control (H200 NVL)</w:t>
+            </w:r>
+          </w:p>
+        </w:tc>
+        <w:tc>
+          <w:tcPr>
+            <w:tcW w:type="dxa" w:w="2160"/>
+          </w:tcPr>
+          <w:p>
+            <w:r/>
+            <w:r>
+              <w:rPr>
+                <w:sz w:val="17"/>
+              </w:rPr>
+              <w:t>100-request ceiling withdrawn; eight runs; includes aborted first instance</w:t>
+            </w:r>
+          </w:p>
+        </w:tc>
+        <w:tc>
+          <w:tcPr>
+            <w:tcW w:type="dxa" w:w="2160"/>
+          </w:tcPr>
+          <w:p>
+            <w:r/>
+            <w:r>
+              <w:rPr>
+                <w:sz w:val="17"/>
+              </w:rPr>
+              <w:t>1.15</w:t>
+            </w:r>
+          </w:p>
+        </w:tc>
+      </w:tr>
     </w:tbl>
     <w:p>
       <w:r>
@@ -5535,7 +5819,7 @@
           <w:color w:val="565B62"/>
           <w:sz w:val="18"/>
         </w:rPr>
-        <w:t>Table 7. All experiments and approximate GPU-hours on single 96 GB GPUs. The paper’s claims were stress-tested by an independent, model-assisted adversarial review over the frozen code, logs, and figures; its findings are reconciled into the text. The review is a check on our reporting, not an empirical validation of the method.</w:t>
+        <w:t>Table 7. All experiments and approximate GPU-hours on single GPUs; J10 used H100 NVL and H200 NVL, and J11 used H200 NVL. The J11 total includes the aborted first instance. The paper’s claims were stress-tested by an independent, model-assisted adversarial review over the frozen code, logs, and figures; its findings are reconciled into the text. The review is a check on our reporting, not an empirical validation of the method.</w:t>
       </w:r>
     </w:p>
     <w:p>
@@ -5611,80 +5895,110 @@
     </w:p>
     <w:p>
       <w:pPr>
-        <w:pStyle w:val="ListNumber"/>
+        <w:ind w:left="360" w:hanging="360"/>
       </w:pPr>
+      <w:r>
+        <w:t xml:space="preserve">1. </w:t>
+      </w:r>
       <w:r>
         <w:t>J. Mu, X. Li, N. Goodman. Learning to Compress Prompts with Gist Tokens. NeurIPS 2023.</w:t>
       </w:r>
     </w:p>
     <w:p>
       <w:pPr>
-        <w:pStyle w:val="ListNumber"/>
+        <w:ind w:left="360" w:hanging="360"/>
       </w:pPr>
+      <w:r>
+        <w:t xml:space="preserve">2. </w:t>
+      </w:r>
       <w:r>
         <w:t>D. Wingate, M. Shoeybi, T. Sorensen. Prompt Compression and Contrastive Conditioning for Controllability and Toxicity Reduction in Language Models. Findings of EMNLP 2022.</w:t>
       </w:r>
     </w:p>
     <w:p>
       <w:pPr>
-        <w:pStyle w:val="ListNumber"/>
+        <w:ind w:left="360" w:hanging="360"/>
       </w:pPr>
+      <w:r>
+        <w:t xml:space="preserve">3. </w:t>
+      </w:r>
       <w:r>
         <w:t>Shopify Engineering. Gisting: context compression for a production coding agent. Technical report, shopify.engineering/gisting, 2025.</w:t>
       </w:r>
     </w:p>
     <w:p>
       <w:pPr>
-        <w:pStyle w:val="ListNumber"/>
+        <w:ind w:left="360" w:hanging="360"/>
       </w:pPr>
+      <w:r>
+        <w:t xml:space="preserve">4. </w:t>
+      </w:r>
       <w:r>
         <w:t>G. Hinton, O. Vinyals, J. Dean. Distilling the Knowledge in a Neural Network. NeurIPS Deep Learning Workshop, 2015.</w:t>
       </w:r>
     </w:p>
     <w:p>
       <w:pPr>
-        <w:pStyle w:val="ListNumber"/>
+        <w:ind w:left="360" w:hanging="360"/>
       </w:pPr>
+      <w:r>
+        <w:t xml:space="preserve">5. </w:t>
+      </w:r>
       <w:r>
         <w:t>A. Gu, T. Dao. Mamba: Linear-Time Sequence Modeling with Selective State Spaces. 2023. (Cited for linear-attention background; the served model’s own configuration, not Mamba, specifies its 16/64 full-attention layer mix.)</w:t>
       </w:r>
     </w:p>
     <w:p>
       <w:pPr>
-        <w:pStyle w:val="ListNumber"/>
+        <w:ind w:left="360" w:hanging="360"/>
       </w:pPr>
+      <w:r>
+        <w:t xml:space="preserve">6. </w:t>
+      </w:r>
       <w:r>
         <w:t>A. Chevalier, A. Wettig, A. Ajith, D. Chen. Adapting Language Models to Compress Contexts (AutoCompressor). EMNLP 2023.</w:t>
       </w:r>
     </w:p>
     <w:p>
       <w:pPr>
-        <w:pStyle w:val="ListNumber"/>
+        <w:ind w:left="360" w:hanging="360"/>
       </w:pPr>
+      <w:r>
+        <w:t xml:space="preserve">7. </w:t>
+      </w:r>
       <w:r>
         <w:t>T. Ge, J. Hu, L. Wang, X. Wang, S. Chen, F. Wei. In-context Autoencoder for Context Compression in a Large Language Model. ICLR 2024.</w:t>
       </w:r>
     </w:p>
     <w:p>
       <w:pPr>
-        <w:pStyle w:val="ListNumber"/>
+        <w:ind w:left="360" w:hanging="360"/>
       </w:pPr>
+      <w:r>
+        <w:t xml:space="preserve">8. </w:t>
+      </w:r>
       <w:r>
         <w:t>B. Lester, R. Al-Rfou, N. Constant. The Power of Scale for Parameter-Efficient Prompt Tuning. EMNLP 2021.</w:t>
       </w:r>
     </w:p>
     <w:p>
       <w:pPr>
-        <w:pStyle w:val="ListNumber"/>
+        <w:ind w:left="360" w:hanging="360"/>
       </w:pPr>
+      <w:r>
+        <w:t xml:space="preserve">9. </w:t>
+      </w:r>
       <w:r>
         <w:t>H. Jiang, Q. Wu, C.-Y. Lin, Y. Yang, L. Qiu. LLMLingua: Compressing Prompts for Accelerated Inference of Large Language Models. EMNLP 2023.</w:t>
       </w:r>
     </w:p>
     <w:p>
       <w:pPr>
-        <w:pStyle w:val="ListNumber"/>
+        <w:ind w:left="360" w:hanging="360"/>
       </w:pPr>
+      <w:r>
+        <w:t xml:space="preserve">10. </w:t>
+      </w:r>
       <w:r>
         <w:t>Anthropic. Advanced tool use: tool search and programmatic tool calling. anthropic.com/engineering/advanced-tool-use, 2025.</w:t>
       </w:r>

</xml_diff>